<commit_message>
Developer, Admin and User Guide Updated
</commit_message>
<xml_diff>
--- a/DEVELOPER_GUIDE.docx
+++ b/DEVELOPER_GUIDE.docx
@@ -15,6 +15,603 @@
         <w:pStyle w:val="Heading1"/>
       </w:pPr>
       <w:r>
+        <w:t>Table of Contents</w:t>
+      </w:r>
+    </w:p>
+    <w:p>
+      <w:pPr>
+        <w:pStyle w:val="ListBullet"/>
+      </w:pPr>
+      <w:r>
+        <w:t>Overview (README)</w:t>
+      </w:r>
+    </w:p>
+    <w:p>
+      <w:pPr>
+        <w:pStyle w:val="ListBullet"/>
+      </w:pPr>
+      <w:r>
+        <w:t>Installation</w:t>
+      </w:r>
+    </w:p>
+    <w:p>
+      <w:pPr>
+        <w:pStyle w:val="ListBullet2"/>
+      </w:pPr>
+      <w:r>
+        <w:t>Prerequisites</w:t>
+      </w:r>
+    </w:p>
+    <w:p>
+      <w:pPr>
+        <w:pStyle w:val="ListBullet2"/>
+      </w:pPr>
+      <w:r>
+        <w:t>Step 1 - Clone the repository</w:t>
+      </w:r>
+    </w:p>
+    <w:p>
+      <w:pPr>
+        <w:pStyle w:val="ListBullet2"/>
+      </w:pPr>
+      <w:r>
+        <w:t>Step 2 - Prepare the working folders</w:t>
+      </w:r>
+    </w:p>
+    <w:p>
+      <w:pPr>
+        <w:pStyle w:val="ListBullet2"/>
+      </w:pPr>
+      <w:r>
+        <w:t>Step 3 - Start PSAT with Docker</w:t>
+      </w:r>
+    </w:p>
+    <w:p>
+      <w:pPr>
+        <w:pStyle w:val="ListBullet2"/>
+      </w:pPr>
+      <w:r>
+        <w:t>First-run checklist inside the app</w:t>
+      </w:r>
+    </w:p>
+    <w:p>
+      <w:pPr>
+        <w:pStyle w:val="ListBullet2"/>
+      </w:pPr>
+      <w:r>
+        <w:t>Persistence</w:t>
+      </w:r>
+    </w:p>
+    <w:p>
+      <w:pPr>
+        <w:pStyle w:val="ListBullet2"/>
+      </w:pPr>
+      <w:r>
+        <w:t>Ports</w:t>
+      </w:r>
+    </w:p>
+    <w:p>
+      <w:pPr>
+        <w:pStyle w:val="ListBullet2"/>
+      </w:pPr>
+      <w:r>
+        <w:t>Updating the stack</w:t>
+      </w:r>
+    </w:p>
+    <w:p>
+      <w:pPr>
+        <w:pStyle w:val="ListBullet2"/>
+      </w:pPr>
+      <w:r>
+        <w:t>Running without Docker</w:t>
+      </w:r>
+    </w:p>
+    <w:p>
+      <w:pPr>
+        <w:pStyle w:val="ListBullet"/>
+      </w:pPr>
+      <w:r>
+        <w:t>Architecture Overview</w:t>
+      </w:r>
+    </w:p>
+    <w:p>
+      <w:pPr>
+        <w:pStyle w:val="ListBullet2"/>
+      </w:pPr>
+      <w:r>
+        <w:t>System diagram</w:t>
+      </w:r>
+    </w:p>
+    <w:p>
+      <w:pPr>
+        <w:pStyle w:val="ListBullet2"/>
+      </w:pPr>
+      <w:r>
+        <w:t>High-level flow</w:t>
+      </w:r>
+    </w:p>
+    <w:p>
+      <w:pPr>
+        <w:pStyle w:val="ListBullet2"/>
+      </w:pPr>
+      <w:r>
+        <w:t>Backend structure</w:t>
+      </w:r>
+    </w:p>
+    <w:p>
+      <w:pPr>
+        <w:pStyle w:val="ListBullet2"/>
+      </w:pPr>
+      <w:r>
+        <w:t>Frontend structure</w:t>
+      </w:r>
+    </w:p>
+    <w:p>
+      <w:pPr>
+        <w:pStyle w:val="ListBullet2"/>
+      </w:pPr>
+      <w:r>
+        <w:t>Project storage model</w:t>
+      </w:r>
+    </w:p>
+    <w:p>
+      <w:pPr>
+        <w:pStyle w:val="ListBullet2"/>
+      </w:pPr>
+      <w:r>
+        <w:t>Project creation pipeline</w:t>
+      </w:r>
+    </w:p>
+    <w:p>
+      <w:pPr>
+        <w:pStyle w:val="ListBullet2"/>
+      </w:pPr>
+      <w:r>
+        <w:t>Multi-project aggregation pattern</w:t>
+      </w:r>
+    </w:p>
+    <w:p>
+      <w:pPr>
+        <w:pStyle w:val="ListBullet2"/>
+      </w:pPr>
+      <w:r>
+        <w:t>Shapefile management architecture</w:t>
+      </w:r>
+    </w:p>
+    <w:p>
+      <w:pPr>
+        <w:pStyle w:val="ListBullet2"/>
+      </w:pPr>
+      <w:r>
+        <w:t>Key design choices</w:t>
+      </w:r>
+    </w:p>
+    <w:p>
+      <w:pPr>
+        <w:pStyle w:val="ListBullet"/>
+      </w:pPr>
+      <w:r>
+        <w:t>API Reference</w:t>
+      </w:r>
+    </w:p>
+    <w:p>
+      <w:pPr>
+        <w:pStyle w:val="ListBullet2"/>
+      </w:pPr>
+      <w:r>
+        <w:t>Health</w:t>
+      </w:r>
+    </w:p>
+    <w:p>
+      <w:pPr>
+        <w:pStyle w:val="ListBullet2"/>
+      </w:pPr>
+      <w:r>
+        <w:t>Project listing and metadata</w:t>
+      </w:r>
+    </w:p>
+    <w:p>
+      <w:pPr>
+        <w:pStyle w:val="ListBullet2"/>
+      </w:pPr>
+      <w:r>
+        <w:t>Project data</w:t>
+      </w:r>
+    </w:p>
+    <w:p>
+      <w:pPr>
+        <w:pStyle w:val="ListBullet2"/>
+      </w:pPr>
+      <w:r>
+        <w:t>Attribute mappings</w:t>
+      </w:r>
+    </w:p>
+    <w:p>
+      <w:pPr>
+        <w:pStyle w:val="ListBullet2"/>
+      </w:pPr>
+      <w:r>
+        <w:t>Project creation and source discovery</w:t>
+      </w:r>
+    </w:p>
+    <w:p>
+      <w:pPr>
+        <w:pStyle w:val="ListBullet2"/>
+      </w:pPr>
+      <w:r>
+        <w:t>Segment management and copying</w:t>
+      </w:r>
+    </w:p>
+    <w:p>
+      <w:pPr>
+        <w:pStyle w:val="ListBullet2"/>
+      </w:pPr>
+      <w:r>
+        <w:t>Autocode endpoints</w:t>
+      </w:r>
+    </w:p>
+    <w:p>
+      <w:pPr>
+        <w:pStyle w:val="ListBullet2"/>
+      </w:pPr>
+      <w:r>
+        <w:t>Baseline endpoints</w:t>
+      </w:r>
+    </w:p>
+    <w:p>
+      <w:pPr>
+        <w:pStyle w:val="ListBullet2"/>
+      </w:pPr>
+      <w:r>
+        <w:t>Visualization and GIS-context endpoints</w:t>
+      </w:r>
+    </w:p>
+    <w:p>
+      <w:pPr>
+        <w:pStyle w:val="ListBullet2"/>
+      </w:pPr>
+      <w:r>
+        <w:t>Treatment endpoints</w:t>
+      </w:r>
+    </w:p>
+    <w:p>
+      <w:pPr>
+        <w:pStyle w:val="ListBullet2"/>
+      </w:pPr>
+      <w:r>
+        <w:t>Image export</w:t>
+      </w:r>
+    </w:p>
+    <w:p>
+      <w:pPr>
+        <w:pStyle w:val="ListBullet2"/>
+      </w:pPr>
+      <w:r>
+        <w:t>Shapefile management API</w:t>
+      </w:r>
+    </w:p>
+    <w:p>
+      <w:pPr>
+        <w:pStyle w:val="ListBullet2"/>
+      </w:pPr>
+      <w:r>
+        <w:t>Common status codes</w:t>
+      </w:r>
+    </w:p>
+    <w:p>
+      <w:pPr>
+        <w:pStyle w:val="ListBullet"/>
+      </w:pPr>
+      <w:r>
+        <w:t>CV / ML Pipeline</w:t>
+      </w:r>
+    </w:p>
+    <w:p>
+      <w:pPr>
+        <w:pStyle w:val="ListBullet2"/>
+      </w:pPr>
+      <w:r>
+        <w:t>Overview</w:t>
+      </w:r>
+    </w:p>
+    <w:p>
+      <w:pPr>
+        <w:pStyle w:val="ListBullet2"/>
+      </w:pPr>
+      <w:r>
+        <w:t>Model Files</w:t>
+      </w:r>
+    </w:p>
+    <w:p>
+      <w:pPr>
+        <w:pStyle w:val="ListBullet2"/>
+      </w:pPr>
+      <w:r>
+        <w:t>Auto-coding in Bulk</w:t>
+      </w:r>
+    </w:p>
+    <w:p>
+      <w:pPr>
+        <w:pStyle w:val="ListBullet2"/>
+      </w:pPr>
+      <w:r>
+        <w:t>Confidence Thresholds (Summary)</w:t>
+      </w:r>
+    </w:p>
+    <w:p>
+      <w:pPr>
+        <w:pStyle w:val="ListBullet2"/>
+      </w:pPr>
+      <w:r>
+        <w:t>Attributes Auto-coded by CV</w:t>
+      </w:r>
+    </w:p>
+    <w:p>
+      <w:pPr>
+        <w:pStyle w:val="ListBullet2"/>
+      </w:pPr>
+      <w:r>
+        <w:t>GIS Auto-coding</w:t>
+      </w:r>
+    </w:p>
+    <w:p>
+      <w:pPr>
+        <w:pStyle w:val="ListBullet"/>
+      </w:pPr>
+      <w:r>
+        <w:t>Scoring Logic</w:t>
+      </w:r>
+    </w:p>
+    <w:p>
+      <w:pPr>
+        <w:pStyle w:val="ListBullet2"/>
+      </w:pPr>
+      <w:r>
+        <w:t>Overview</w:t>
+      </w:r>
+    </w:p>
+    <w:p>
+      <w:pPr>
+        <w:pStyle w:val="ListBullet2"/>
+      </w:pPr>
+      <w:r>
+        <w:t>Risk Bands</w:t>
+      </w:r>
+    </w:p>
+    <w:p>
+      <w:pPr>
+        <w:pStyle w:val="ListBullet2"/>
+      </w:pPr>
+      <w:r>
+        <w:t>Algorithm: Component Formulas</w:t>
+      </w:r>
+    </w:p>
+    <w:p>
+      <w:pPr>
+        <w:pStyle w:val="ListBullet2"/>
+      </w:pPr>
+      <w:r>
+        <w:t>Worked Example: CM3</w:t>
+      </w:r>
+    </w:p>
+    <w:p>
+      <w:pPr>
+        <w:pStyle w:val="ListBullet2"/>
+      </w:pPr>
+      <w:r>
+        <w:t>Attribute Fields Reference</w:t>
+      </w:r>
+    </w:p>
+    <w:p>
+      <w:pPr>
+        <w:pStyle w:val="ListBullet2"/>
+      </w:pPr>
+      <w:r>
+        <w:t>`cyclerap_scoring.py` — Function Reference</w:t>
+      </w:r>
+    </w:p>
+    <w:p>
+      <w:pPr>
+        <w:pStyle w:val="ListBullet2"/>
+      </w:pPr>
+      <w:r>
+        <w:t>Treatment Logic</w:t>
+      </w:r>
+    </w:p>
+    <w:p>
+      <w:pPr>
+        <w:pStyle w:val="ListBullet2"/>
+      </w:pPr>
+      <w:r>
+        <w:t>Updating the CycleRAP Algorithm</w:t>
+      </w:r>
+    </w:p>
+    <w:p>
+      <w:pPr>
+        <w:pStyle w:val="ListBullet"/>
+      </w:pPr>
+      <w:r>
+        <w:t>Frontend</w:t>
+      </w:r>
+    </w:p>
+    <w:p>
+      <w:pPr>
+        <w:pStyle w:val="ListBullet2"/>
+      </w:pPr>
+      <w:r>
+        <w:t>Route map</w:t>
+      </w:r>
+    </w:p>
+    <w:p>
+      <w:pPr>
+        <w:pStyle w:val="ListBullet2"/>
+      </w:pPr>
+      <w:r>
+        <w:t>Page behavior</w:t>
+      </w:r>
+    </w:p>
+    <w:p>
+      <w:pPr>
+        <w:pStyle w:val="ListBullet2"/>
+      </w:pPr>
+      <w:r>
+        <w:t>API client highlights</w:t>
+      </w:r>
+    </w:p>
+    <w:p>
+      <w:pPr>
+        <w:pStyle w:val="ListBullet2"/>
+      </w:pPr>
+      <w:r>
+        <w:t>Visual analysis components</w:t>
+      </w:r>
+    </w:p>
+    <w:p>
+      <w:pPr>
+        <w:pStyle w:val="ListBullet2"/>
+      </w:pPr>
+      <w:r>
+        <w:t>State management</w:t>
+      </w:r>
+    </w:p>
+    <w:p>
+      <w:pPr>
+        <w:pStyle w:val="ListBullet2"/>
+      </w:pPr>
+      <w:r>
+        <w:t>nginx behavior</w:t>
+      </w:r>
+    </w:p>
+    <w:p>
+      <w:pPr>
+        <w:pStyle w:val="ListBullet"/>
+      </w:pPr>
+      <w:r>
+        <w:t>Common Issues</w:t>
+      </w:r>
+    </w:p>
+    <w:p>
+      <w:pPr>
+        <w:pStyle w:val="ListBullet2"/>
+      </w:pPr>
+      <w:r>
+        <w:t>Docker and startup</w:t>
+      </w:r>
+    </w:p>
+    <w:p>
+      <w:pPr>
+        <w:pStyle w:val="ListBullet2"/>
+      </w:pPr>
+      <w:r>
+        <w:t>Models and shapefiles</w:t>
+      </w:r>
+    </w:p>
+    <w:p>
+      <w:pPr>
+        <w:pStyle w:val="ListBullet2"/>
+      </w:pPr>
+      <w:r>
+        <w:t>`in/` folder and source images</w:t>
+      </w:r>
+    </w:p>
+    <w:p>
+      <w:pPr>
+        <w:pStyle w:val="ListBullet2"/>
+      </w:pPr>
+      <w:r>
+        <w:t>Polygon and road selection</w:t>
+      </w:r>
+    </w:p>
+    <w:p>
+      <w:pPr>
+        <w:pStyle w:val="ListBullet2"/>
+      </w:pPr>
+      <w:r>
+        <w:t>Project metadata and search</w:t>
+      </w:r>
+    </w:p>
+    <w:p>
+      <w:pPr>
+        <w:pStyle w:val="ListBullet2"/>
+      </w:pPr>
+      <w:r>
+        <w:t>Scoring and coding</w:t>
+      </w:r>
+    </w:p>
+    <w:p>
+      <w:pPr>
+        <w:pStyle w:val="ListBullet2"/>
+      </w:pPr>
+      <w:r>
+        <w:t>Documentation drift</w:t>
+      </w:r>
+    </w:p>
+    <w:p>
+      <w:pPr>
+        <w:pStyle w:val="ListBullet2"/>
+      </w:pPr>
+      <w:r>
+        <w:t>Data recovery</w:t>
+      </w:r>
+    </w:p>
+    <w:p>
+      <w:pPr>
+        <w:pStyle w:val="ListBullet"/>
+      </w:pPr>
+      <w:r>
+        <w:t>Contributing</w:t>
+      </w:r>
+    </w:p>
+    <w:p>
+      <w:pPr>
+        <w:pStyle w:val="ListBullet2"/>
+      </w:pPr>
+      <w:r>
+        <w:t>Working style</w:t>
+      </w:r>
+    </w:p>
+    <w:p>
+      <w:pPr>
+        <w:pStyle w:val="ListBullet2"/>
+      </w:pPr>
+      <w:r>
+        <w:t>Validation expectations</w:t>
+      </w:r>
+    </w:p>
+    <w:p>
+      <w:pPr>
+        <w:pStyle w:val="ListBullet2"/>
+      </w:pPr>
+      <w:r>
+        <w:t>Documentation rule</w:t>
+      </w:r>
+    </w:p>
+    <w:p>
+      <w:pPr>
+        <w:pStyle w:val="ListBullet2"/>
+      </w:pPr>
+      <w:r>
+        <w:t>Project-data safety</w:t>
+      </w:r>
+    </w:p>
+    <w:p>
+      <w:pPr>
+        <w:pStyle w:val="ListBullet2"/>
+      </w:pPr>
+      <w:r>
+        <w:t>Local development</w:t>
+      </w:r>
+    </w:p>
+    <w:p>
+      <w:r>
+        <w:br w:type="page"/>
+      </w:r>
+    </w:p>
+    <w:p>
+      <w:pPr>
+        <w:pStyle w:val="Heading1"/>
+      </w:pPr>
+      <w:r>
         <w:t>Path Safety Assessment Tool (PSAT)</w:t>
       </w:r>
     </w:p>
@@ -2128,6 +2725,20 @@
     </w:p>
     <w:p>
       <w:r>
+        <w:t xml:space="preserve">&gt; </w:t>
+      </w:r>
+      <w:r>
+        <w:rPr>
+          <w:b/>
+        </w:rPr>
+        <w:t>Recent Addition:</w:t>
+      </w:r>
+      <w:r>
+        <w:t xml:space="preserve"> Persisted project provenance via `dataset` and `source_folders`.</w:t>
+      </w:r>
+    </w:p>
+    <w:p>
+      <w:r>
         <w:t>The metadata model now carries more than name and tags. Relevant fields include:</w:t>
       </w:r>
     </w:p>
@@ -2235,6 +2846,20 @@
       </w:pPr>
       <w:r>
         <w:t>Sidecar directories</w:t>
+      </w:r>
+    </w:p>
+    <w:p>
+      <w:r>
+        <w:t xml:space="preserve">&gt; </w:t>
+      </w:r>
+      <w:r>
+        <w:rPr>
+          <w:b/>
+        </w:rPr>
+        <w:t>Recent Addition:</w:t>
+      </w:r>
+      <w:r>
+        <w:t xml:space="preserve"> Baseline and autocode-metadata storage used by validation workflows.</w:t>
       </w:r>
     </w:p>
     <w:p>
@@ -8177,6 +8802,69 @@
     </w:p>
     <w:p>
       <w:r>
+        <w:t>---</w:t>
+      </w:r>
+    </w:p>
+    <w:p>
+      <w:pPr>
+        <w:pStyle w:val="Heading2"/>
+      </w:pPr>
+      <w:r>
+        <w:t>Updating the CycleRAP Algorithm</w:t>
+      </w:r>
+    </w:p>
+    <w:p>
+      <w:r>
+        <w:t>When CycleRAP releases an updated risk scoring model (e.g., transitioning from v2.11 to a newer version), the development team must update the scoring module.</w:t>
+      </w:r>
+    </w:p>
+    <w:p>
+      <w:r>
+        <w:t>Administrators are advised to contact developers when a new model is released. The update process generally involves the following steps:</w:t>
+      </w:r>
+    </w:p>
+    <w:p>
+      <w:pPr>
+        <w:pStyle w:val="ListNumber"/>
+      </w:pPr>
+      <w:r>
+        <w:t>**Reviewing the New Specifications**: Obtain the new CycleRAP methodology documentation or Excel reference tool.</w:t>
+      </w:r>
+    </w:p>
+    <w:p>
+      <w:pPr>
+        <w:pStyle w:val="ListNumber"/>
+      </w:pPr>
+      <w:r>
+        <w:t>**Updating `LOOKUP_TABLES`**: Modify the attribute-to-risk-factor dictionaries in `backend/app/services/cyclerap_scoring.py` to match the new multipliers.</w:t>
+      </w:r>
+    </w:p>
+    <w:p>
+      <w:pPr>
+        <w:pStyle w:val="ListNumber"/>
+      </w:pPr>
+      <w:r>
+        <w:t>**Adjusting Formula Equations**: If new formulas are introduced for intermediate components (e.g., `CM3`, `CM16`, `CM25`, `CM40`) or final scores (`BB`, `BP`, `SB`, `VB`), update the corresponding `calculate_cmX()` and `calculate_cyclerap_score()` functions.</w:t>
+      </w:r>
+    </w:p>
+    <w:p>
+      <w:pPr>
+        <w:pStyle w:val="ListNumber"/>
+      </w:pPr>
+      <w:r>
+        <w:t>**Modifying Attribute Definitions**: If the new model introduces new fields or changes the allowed values (enums) for existing fields, update the data model, including frontend forms and backend shapefile ingestion validation.</w:t>
+      </w:r>
+    </w:p>
+    <w:p>
+      <w:pPr>
+        <w:pStyle w:val="ListNumber"/>
+      </w:pPr>
+      <w:r>
+        <w:t>**Testing**: Validate the updated Python output against the new official CycleRAP reference tool (typically using a test batch of road segments) to ensure full fidelity.</w:t>
+      </w:r>
+    </w:p>
+    <w:p>
+      <w:r>
         <w:br w:type="page"/>
       </w:r>
     </w:p>
@@ -8372,6 +9060,20 @@
     </w:p>
     <w:p>
       <w:r>
+        <w:t xml:space="preserve">&gt; </w:t>
+      </w:r>
+      <w:r>
+        <w:rPr>
+          <w:b/>
+        </w:rPr>
+        <w:t>Recent Addition:</w:t>
+      </w:r>
+      <w:r>
+        <w:t xml:space="preserve"> Fuzzy project search that also matches source road names.</w:t>
+      </w:r>
+    </w:p>
+    <w:p>
+      <w:r>
         <w:t>`Projects` is the operational home screen.</w:t>
       </w:r>
     </w:p>
@@ -8487,6 +9189,20 @@
       </w:pPr>
       <w:r>
         <w:t>Create Project page</w:t>
+      </w:r>
+    </w:p>
+    <w:p>
+      <w:r>
+        <w:t xml:space="preserve">&gt; </w:t>
+      </w:r>
+      <w:r>
+        <w:rPr>
+          <w:b/>
+        </w:rPr>
+        <w:t>Recent Addition:</w:t>
+      </w:r>
+      <w:r>
+        <w:t xml:space="preserve"> Multi-road project creation from a drawn polygon or selected planning area.</w:t>
       </w:r>
     </w:p>
     <w:p>
@@ -8814,6 +9530,20 @@
     </w:p>
     <w:p>
       <w:r>
+        <w:t xml:space="preserve">&gt; </w:t>
+      </w:r>
+      <w:r>
+        <w:rPr>
+          <w:b/>
+        </w:rPr>
+        <w:t>Recent Addition:</w:t>
+      </w:r>
+      <w:r>
+        <w:t xml:space="preserve"> Treatment-effectiveness ranking for both project-wide and per-segment views.</w:t>
+      </w:r>
+    </w:p>
+    <w:p>
+      <w:r>
         <w:t>`TreatmentPage` is the picker / filter view. It mirrors the project-or-road search behavior introduced on the Projects page.</w:t>
       </w:r>
     </w:p>
@@ -8876,6 +9606,20 @@
       </w:pPr>
       <w:r>
         <w:t>GIS Layers page</w:t>
+      </w:r>
+    </w:p>
+    <w:p>
+      <w:r>
+        <w:t xml:space="preserve">&gt; </w:t>
+      </w:r>
+      <w:r>
+        <w:rPr>
+          <w:b/>
+        </w:rPr>
+        <w:t>Recent Addition:</w:t>
+      </w:r>
+      <w:r>
+        <w:t xml:space="preserve"> Dedicated GIS Layers page with upload, preview, replace, and delete flows.</w:t>
       </w:r>
     </w:p>
     <w:p>

</xml_diff>